<commit_message>
feat: sales documents, inventory stocktake, and customer import
Adds delivery docket/invoice mail merge, sales order UI and CSV import,
customer/site import aliases, stocktake flow, contact payment/pricing fields,
and SQLite-safe migrations.

Co-authored-by: Cursor <cursoragent@cursor.com>
</commit_message>
<xml_diff>
--- a/templates/Delivery_Docket.docx
+++ b/templates/Delivery_Docket.docx
@@ -13,7 +13,7 @@
           <w:noProof/>
         </w:rPr>
         <w:drawing>
-          <wp:anchor distT="0" distB="0" distL="114300" distR="114300" simplePos="0" relativeHeight="251660288" behindDoc="0" locked="0" layoutInCell="1" allowOverlap="1" wp14:anchorId="7AF79A6D" wp14:editId="20C818CF">
+          <wp:anchor distT="0" distB="0" distL="114300" distR="114300" simplePos="0" relativeHeight="251660288" behindDoc="0" locked="0" layoutInCell="1" allowOverlap="1" wp14:anchorId="7AF79A6D" wp14:editId="13F262BF">
             <wp:simplePos x="0" y="0"/>
             <wp:positionH relativeFrom="column">
               <wp:posOffset>4316997</wp:posOffset>
@@ -160,13 +160,22 @@
                               <w:spacing w:after="0" w:line="240" w:lineRule="auto"/>
                               <w:suppressOverlap/>
                               <w:rPr>
+                                <w:sz w:val="18"/>
+                                <w:szCs w:val="18"/>
+                              </w:rPr>
+                            </w:pPr>
+                            <w:proofErr w:type="gramStart"/>
+                            <w:r>
+                              <w:rPr>
                                 <w:rFonts w:ascii="Arial" w:eastAsia="Arial" w:hAnsi="Arial" w:cs="Arial"/>
                                 <w:bCs/>
                                 <w:color w:val="000000" w:themeColor="text1"/>
                                 <w:sz w:val="18"/>
                                 <w:szCs w:val="18"/>
                               </w:rPr>
-                            </w:pPr>
+                              <w:t>{{ contact.name</w:t>
+                            </w:r>
+                            <w:proofErr w:type="gramEnd"/>
                             <w:r>
                               <w:rPr>
                                 <w:rFonts w:ascii="Arial" w:eastAsia="Arial" w:hAnsi="Arial" w:cs="Arial"/>
@@ -175,7 +184,7 @@
                                 <w:sz w:val="18"/>
                                 <w:szCs w:val="18"/>
                               </w:rPr>
-                              <w:t>{{ contact.name }}</w:t>
+                              <w:t xml:space="preserve"> }}</w:t>
                             </w:r>
                             <w:r>
                               <w:rPr>
@@ -187,16 +196,53 @@
                               </w:rPr>
                               <w:t xml:space="preserve"> - </w:t>
                             </w:r>
-                            <w:r>
+                            <w:proofErr w:type="gramStart"/>
+                            <w:r>
+                              <w:rPr>
+                                <w:sz w:val="18"/>
+                                <w:szCs w:val="18"/>
+                              </w:rPr>
                               <w:t xml:space="preserve">{{ </w:t>
                             </w:r>
                             <w:proofErr w:type="spellStart"/>
                             <w:r>
-                              <w:t>contact.code</w:t>
+                              <w:rPr>
+                                <w:sz w:val="18"/>
+                                <w:szCs w:val="18"/>
+                              </w:rPr>
+                              <w:t>contact</w:t>
+                            </w:r>
+                            <w:proofErr w:type="gramEnd"/>
+                            <w:r>
+                              <w:rPr>
+                                <w:sz w:val="18"/>
+                                <w:szCs w:val="18"/>
+                              </w:rPr>
+                              <w:t>.</w:t>
+                            </w:r>
+                            <w:proofErr w:type="gramStart"/>
+                            <w:r>
+                              <w:rPr>
+                                <w:sz w:val="18"/>
+                                <w:szCs w:val="18"/>
+                              </w:rPr>
+                              <w:t>code</w:t>
                             </w:r>
                             <w:proofErr w:type="spellEnd"/>
                             <w:r>
-                              <w:t xml:space="preserve"> }}</w:t>
+                              <w:rPr>
+                                <w:sz w:val="18"/>
+                                <w:szCs w:val="18"/>
+                              </w:rPr>
+                              <w:t xml:space="preserve"> }</w:t>
+                            </w:r>
+                            <w:proofErr w:type="gramEnd"/>
+                            <w:r>
+                              <w:rPr>
+                                <w:sz w:val="18"/>
+                                <w:szCs w:val="18"/>
+                              </w:rPr>
+                              <w:t>}</w:t>
                             </w:r>
                           </w:p>
                           <w:p>
@@ -204,32 +250,109 @@
                               <w:spacing w:after="0" w:line="240" w:lineRule="auto"/>
                               <w:suppressOverlap/>
                               <w:rPr>
+                                <w:rFonts w:ascii="Arial" w:eastAsia="Arial" w:hAnsi="Arial" w:cs="Arial"/>
                                 <w:bCs/>
                                 <w:color w:val="000000" w:themeColor="text1"/>
+                                <w:sz w:val="18"/>
+                                <w:szCs w:val="18"/>
                               </w:rPr>
                             </w:pPr>
-                            <w:r>
+                            <w:proofErr w:type="gramStart"/>
+                            <w:r>
+                              <w:rPr>
+                                <w:sz w:val="18"/>
+                                <w:szCs w:val="18"/>
+                              </w:rPr>
+                              <w:t xml:space="preserve">{{ </w:t>
+                            </w:r>
+                            <w:proofErr w:type="spellStart"/>
+                            <w:r>
+                              <w:rPr>
+                                <w:sz w:val="18"/>
+                                <w:szCs w:val="18"/>
+                              </w:rPr>
+                              <w:t>contact.abn</w:t>
+                            </w:r>
+                            <w:proofErr w:type="spellEnd"/>
+                            <w:proofErr w:type="gramEnd"/>
+                            <w:r>
+                              <w:rPr>
+                                <w:sz w:val="18"/>
+                                <w:szCs w:val="18"/>
+                              </w:rPr>
+                              <w:t xml:space="preserve"> }}</w:t>
+                            </w:r>
+                          </w:p>
+                          <w:p>
+                            <w:pPr>
+                              <w:spacing w:after="0" w:line="240" w:lineRule="auto"/>
+                              <w:suppressOverlap/>
                               <w:rPr>
                                 <w:bCs/>
                                 <w:color w:val="000000" w:themeColor="text1"/>
-                              </w:rPr>
-                              <w:t xml:space="preserve">{{ </w:t>
-                            </w:r>
-                            <w:proofErr w:type="spellStart"/>
+                                <w:sz w:val="18"/>
+                                <w:szCs w:val="18"/>
+                              </w:rPr>
+                            </w:pPr>
+                            <w:proofErr w:type="gramStart"/>
                             <w:r>
                               <w:rPr>
                                 <w:bCs/>
                                 <w:color w:val="000000" w:themeColor="text1"/>
-                              </w:rPr>
-                              <w:t>contact.address</w:t>
-                            </w:r>
-                            <w:proofErr w:type="spellEnd"/>
+                                <w:sz w:val="18"/>
+                                <w:szCs w:val="18"/>
+                              </w:rPr>
+                              <w:t xml:space="preserve">{{ </w:t>
+                            </w:r>
+                            <w:proofErr w:type="spellStart"/>
                             <w:r>
                               <w:rPr>
                                 <w:bCs/>
                                 <w:color w:val="000000" w:themeColor="text1"/>
-                              </w:rPr>
-                              <w:t xml:space="preserve"> }}</w:t>
+                                <w:sz w:val="18"/>
+                                <w:szCs w:val="18"/>
+                              </w:rPr>
+                              <w:t>contact</w:t>
+                            </w:r>
+                            <w:proofErr w:type="gramEnd"/>
+                            <w:r>
+                              <w:rPr>
+                                <w:bCs/>
+                                <w:color w:val="000000" w:themeColor="text1"/>
+                                <w:sz w:val="18"/>
+                                <w:szCs w:val="18"/>
+                              </w:rPr>
+                              <w:t>.</w:t>
+                            </w:r>
+                            <w:proofErr w:type="gramStart"/>
+                            <w:r>
+                              <w:rPr>
+                                <w:bCs/>
+                                <w:color w:val="000000" w:themeColor="text1"/>
+                                <w:sz w:val="18"/>
+                                <w:szCs w:val="18"/>
+                              </w:rPr>
+                              <w:t>address</w:t>
+                            </w:r>
+                            <w:proofErr w:type="spellEnd"/>
+                            <w:r>
+                              <w:rPr>
+                                <w:bCs/>
+                                <w:color w:val="000000" w:themeColor="text1"/>
+                                <w:sz w:val="18"/>
+                                <w:szCs w:val="18"/>
+                              </w:rPr>
+                              <w:t xml:space="preserve"> }</w:t>
+                            </w:r>
+                            <w:proofErr w:type="gramEnd"/>
+                            <w:r>
+                              <w:rPr>
+                                <w:bCs/>
+                                <w:color w:val="000000" w:themeColor="text1"/>
+                                <w:sz w:val="18"/>
+                                <w:szCs w:val="18"/>
+                              </w:rPr>
+                              <w:t>}</w:t>
                             </w:r>
                           </w:p>
                         </w:txbxContent>
@@ -285,13 +408,22 @@
                         <w:spacing w:after="0" w:line="240" w:lineRule="auto"/>
                         <w:suppressOverlap/>
                         <w:rPr>
+                          <w:sz w:val="18"/>
+                          <w:szCs w:val="18"/>
+                        </w:rPr>
+                      </w:pPr>
+                      <w:proofErr w:type="gramStart"/>
+                      <w:r>
+                        <w:rPr>
                           <w:rFonts w:ascii="Arial" w:eastAsia="Arial" w:hAnsi="Arial" w:cs="Arial"/>
                           <w:bCs/>
                           <w:color w:val="000000" w:themeColor="text1"/>
                           <w:sz w:val="18"/>
                           <w:szCs w:val="18"/>
                         </w:rPr>
-                      </w:pPr>
+                        <w:t>{{ contact.name</w:t>
+                      </w:r>
+                      <w:proofErr w:type="gramEnd"/>
                       <w:r>
                         <w:rPr>
                           <w:rFonts w:ascii="Arial" w:eastAsia="Arial" w:hAnsi="Arial" w:cs="Arial"/>
@@ -300,7 +432,7 @@
                           <w:sz w:val="18"/>
                           <w:szCs w:val="18"/>
                         </w:rPr>
-                        <w:t>{{ contact.name }}</w:t>
+                        <w:t xml:space="preserve"> }}</w:t>
                       </w:r>
                       <w:r>
                         <w:rPr>
@@ -312,16 +444,53 @@
                         </w:rPr>
                         <w:t xml:space="preserve"> - </w:t>
                       </w:r>
-                      <w:r>
+                      <w:proofErr w:type="gramStart"/>
+                      <w:r>
+                        <w:rPr>
+                          <w:sz w:val="18"/>
+                          <w:szCs w:val="18"/>
+                        </w:rPr>
                         <w:t xml:space="preserve">{{ </w:t>
                       </w:r>
                       <w:proofErr w:type="spellStart"/>
                       <w:r>
-                        <w:t>contact.code</w:t>
+                        <w:rPr>
+                          <w:sz w:val="18"/>
+                          <w:szCs w:val="18"/>
+                        </w:rPr>
+                        <w:t>contact</w:t>
+                      </w:r>
+                      <w:proofErr w:type="gramEnd"/>
+                      <w:r>
+                        <w:rPr>
+                          <w:sz w:val="18"/>
+                          <w:szCs w:val="18"/>
+                        </w:rPr>
+                        <w:t>.</w:t>
+                      </w:r>
+                      <w:proofErr w:type="gramStart"/>
+                      <w:r>
+                        <w:rPr>
+                          <w:sz w:val="18"/>
+                          <w:szCs w:val="18"/>
+                        </w:rPr>
+                        <w:t>code</w:t>
                       </w:r>
                       <w:proofErr w:type="spellEnd"/>
                       <w:r>
-                        <w:t xml:space="preserve"> }}</w:t>
+                        <w:rPr>
+                          <w:sz w:val="18"/>
+                          <w:szCs w:val="18"/>
+                        </w:rPr>
+                        <w:t xml:space="preserve"> }</w:t>
+                      </w:r>
+                      <w:proofErr w:type="gramEnd"/>
+                      <w:r>
+                        <w:rPr>
+                          <w:sz w:val="18"/>
+                          <w:szCs w:val="18"/>
+                        </w:rPr>
+                        <w:t>}</w:t>
                       </w:r>
                     </w:p>
                     <w:p>
@@ -329,32 +498,109 @@
                         <w:spacing w:after="0" w:line="240" w:lineRule="auto"/>
                         <w:suppressOverlap/>
                         <w:rPr>
+                          <w:rFonts w:ascii="Arial" w:eastAsia="Arial" w:hAnsi="Arial" w:cs="Arial"/>
                           <w:bCs/>
                           <w:color w:val="000000" w:themeColor="text1"/>
+                          <w:sz w:val="18"/>
+                          <w:szCs w:val="18"/>
                         </w:rPr>
                       </w:pPr>
-                      <w:r>
+                      <w:proofErr w:type="gramStart"/>
+                      <w:r>
+                        <w:rPr>
+                          <w:sz w:val="18"/>
+                          <w:szCs w:val="18"/>
+                        </w:rPr>
+                        <w:t xml:space="preserve">{{ </w:t>
+                      </w:r>
+                      <w:proofErr w:type="spellStart"/>
+                      <w:r>
+                        <w:rPr>
+                          <w:sz w:val="18"/>
+                          <w:szCs w:val="18"/>
+                        </w:rPr>
+                        <w:t>contact.abn</w:t>
+                      </w:r>
+                      <w:proofErr w:type="spellEnd"/>
+                      <w:proofErr w:type="gramEnd"/>
+                      <w:r>
+                        <w:rPr>
+                          <w:sz w:val="18"/>
+                          <w:szCs w:val="18"/>
+                        </w:rPr>
+                        <w:t xml:space="preserve"> }}</w:t>
+                      </w:r>
+                    </w:p>
+                    <w:p>
+                      <w:pPr>
+                        <w:spacing w:after="0" w:line="240" w:lineRule="auto"/>
+                        <w:suppressOverlap/>
                         <w:rPr>
                           <w:bCs/>
                           <w:color w:val="000000" w:themeColor="text1"/>
-                        </w:rPr>
-                        <w:t xml:space="preserve">{{ </w:t>
-                      </w:r>
-                      <w:proofErr w:type="spellStart"/>
+                          <w:sz w:val="18"/>
+                          <w:szCs w:val="18"/>
+                        </w:rPr>
+                      </w:pPr>
+                      <w:proofErr w:type="gramStart"/>
                       <w:r>
                         <w:rPr>
                           <w:bCs/>
                           <w:color w:val="000000" w:themeColor="text1"/>
-                        </w:rPr>
-                        <w:t>contact.address</w:t>
-                      </w:r>
-                      <w:proofErr w:type="spellEnd"/>
+                          <w:sz w:val="18"/>
+                          <w:szCs w:val="18"/>
+                        </w:rPr>
+                        <w:t xml:space="preserve">{{ </w:t>
+                      </w:r>
+                      <w:proofErr w:type="spellStart"/>
                       <w:r>
                         <w:rPr>
                           <w:bCs/>
                           <w:color w:val="000000" w:themeColor="text1"/>
-                        </w:rPr>
-                        <w:t xml:space="preserve"> }}</w:t>
+                          <w:sz w:val="18"/>
+                          <w:szCs w:val="18"/>
+                        </w:rPr>
+                        <w:t>contact</w:t>
+                      </w:r>
+                      <w:proofErr w:type="gramEnd"/>
+                      <w:r>
+                        <w:rPr>
+                          <w:bCs/>
+                          <w:color w:val="000000" w:themeColor="text1"/>
+                          <w:sz w:val="18"/>
+                          <w:szCs w:val="18"/>
+                        </w:rPr>
+                        <w:t>.</w:t>
+                      </w:r>
+                      <w:proofErr w:type="gramStart"/>
+                      <w:r>
+                        <w:rPr>
+                          <w:bCs/>
+                          <w:color w:val="000000" w:themeColor="text1"/>
+                          <w:sz w:val="18"/>
+                          <w:szCs w:val="18"/>
+                        </w:rPr>
+                        <w:t>address</w:t>
+                      </w:r>
+                      <w:proofErr w:type="spellEnd"/>
+                      <w:r>
+                        <w:rPr>
+                          <w:bCs/>
+                          <w:color w:val="000000" w:themeColor="text1"/>
+                          <w:sz w:val="18"/>
+                          <w:szCs w:val="18"/>
+                        </w:rPr>
+                        <w:t xml:space="preserve"> }</w:t>
+                      </w:r>
+                      <w:proofErr w:type="gramEnd"/>
+                      <w:r>
+                        <w:rPr>
+                          <w:bCs/>
+                          <w:color w:val="000000" w:themeColor="text1"/>
+                          <w:sz w:val="18"/>
+                          <w:szCs w:val="18"/>
+                        </w:rPr>
+                        <w:t>}</w:t>
                       </w:r>
                     </w:p>
                   </w:txbxContent>
@@ -459,6 +705,7 @@
                                 <w:szCs w:val="18"/>
                               </w:rPr>
                             </w:pPr>
+                            <w:proofErr w:type="gramStart"/>
                             <w:r>
                               <w:rPr>
                                 <w:rFonts w:ascii="Arial" w:eastAsia="Arial" w:hAnsi="Arial" w:cs="Arial"/>
@@ -478,8 +725,9 @@
                                 <w:sz w:val="18"/>
                                 <w:szCs w:val="18"/>
                               </w:rPr>
-                              <w:t>contact.</w:t>
-                            </w:r>
+                              <w:t>contact</w:t>
+                            </w:r>
+                            <w:proofErr w:type="gramEnd"/>
                             <w:r>
                               <w:rPr>
                                 <w:rFonts w:ascii="Arial" w:eastAsia="Arial" w:hAnsi="Arial" w:cs="Arial"/>
@@ -488,8 +736,9 @@
                                 <w:sz w:val="18"/>
                                 <w:szCs w:val="18"/>
                               </w:rPr>
-                              <w:t>d</w:t>
-                            </w:r>
+                              <w:t>.</w:t>
+                            </w:r>
+                            <w:proofErr w:type="gramStart"/>
                             <w:r>
                               <w:rPr>
                                 <w:rFonts w:ascii="Arial" w:eastAsia="Arial" w:hAnsi="Arial" w:cs="Arial"/>
@@ -498,9 +747,8 @@
                                 <w:sz w:val="18"/>
                                 <w:szCs w:val="18"/>
                               </w:rPr>
-                              <w:t>address</w:t>
-                            </w:r>
-                            <w:proofErr w:type="spellEnd"/>
+                              <w:t>d</w:t>
+                            </w:r>
                             <w:r>
                               <w:rPr>
                                 <w:rFonts w:ascii="Arial" w:eastAsia="Arial" w:hAnsi="Arial" w:cs="Arial"/>
@@ -509,7 +757,29 @@
                                 <w:sz w:val="18"/>
                                 <w:szCs w:val="18"/>
                               </w:rPr>
-                              <w:t xml:space="preserve"> }}</w:t>
+                              <w:t>address</w:t>
+                            </w:r>
+                            <w:proofErr w:type="spellEnd"/>
+                            <w:r>
+                              <w:rPr>
+                                <w:rFonts w:ascii="Arial" w:eastAsia="Arial" w:hAnsi="Arial" w:cs="Arial"/>
+                                <w:bCs/>
+                                <w:color w:val="000000" w:themeColor="text1"/>
+                                <w:sz w:val="18"/>
+                                <w:szCs w:val="18"/>
+                              </w:rPr>
+                              <w:t xml:space="preserve"> }</w:t>
+                            </w:r>
+                            <w:proofErr w:type="gramEnd"/>
+                            <w:r>
+                              <w:rPr>
+                                <w:rFonts w:ascii="Arial" w:eastAsia="Arial" w:hAnsi="Arial" w:cs="Arial"/>
+                                <w:bCs/>
+                                <w:color w:val="000000" w:themeColor="text1"/>
+                                <w:sz w:val="18"/>
+                                <w:szCs w:val="18"/>
+                              </w:rPr>
+                              <w:t>}</w:t>
                             </w:r>
                           </w:p>
                         </w:txbxContent>
@@ -1239,7 +1509,17 @@
                                       <w:szCs w:val="18"/>
                                       <w:lang w:eastAsia="en-AU"/>
                                     </w:rPr>
-                                    <w:t xml:space="preserve">    </w:t>
+                                    <w:t xml:space="preserve"> </w:t>
+                                  </w:r>
+                                  <w:proofErr w:type="gramStart"/>
+                                  <w:r>
+                                    <w:rPr>
+                                      <w:rFonts w:ascii="Arial" w:eastAsia="Arial" w:hAnsi="Arial" w:cs="Arial"/>
+                                      <w:sz w:val="18"/>
+                                      <w:szCs w:val="18"/>
+                                      <w:lang w:eastAsia="en-AU"/>
+                                    </w:rPr>
+                                    <w:t xml:space="preserve">   </w:t>
                                   </w:r>
                                   <w:r>
                                     <w:rPr>
@@ -1259,6 +1539,7 @@
                                     <w:t>PONum</w:t>
                                   </w:r>
                                   <w:proofErr w:type="spellEnd"/>
+                                  <w:proofErr w:type="gramEnd"/>
                                   <w:r>
                                     <w:rPr>
                                       <w:rFonts w:ascii="Arial" w:eastAsia="Arial" w:hAnsi="Arial" w:cs="Arial"/>
@@ -1465,6 +1746,7 @@
                                     </w:rPr>
                                     <w:t xml:space="preserve"> </w:t>
                                   </w:r>
+                                  <w:proofErr w:type="gramStart"/>
                                   <w:r>
                                     <w:t xml:space="preserve">{{ </w:t>
                                   </w:r>
@@ -1473,11 +1755,23 @@
                                     <w:t>do</w:t>
                                   </w:r>
                                   <w:r>
-                                    <w:t>cument.date</w:t>
+                                    <w:t>cument</w:t>
+                                  </w:r>
+                                  <w:proofErr w:type="gramEnd"/>
+                                  <w:r>
+                                    <w:t>.</w:t>
+                                  </w:r>
+                                  <w:proofErr w:type="gramStart"/>
+                                  <w:r>
+                                    <w:t>date</w:t>
                                   </w:r>
                                   <w:proofErr w:type="spellEnd"/>
                                   <w:r>
-                                    <w:t xml:space="preserve"> }}</w:t>
+                                    <w:t xml:space="preserve"> }</w:t>
+                                  </w:r>
+                                  <w:proofErr w:type="gramEnd"/>
+                                  <w:r>
+                                    <w:t>}</w:t>
                                   </w:r>
                                 </w:p>
                               </w:txbxContent>
@@ -1847,16 +2141,29 @@
                               </w:rPr>
                               <w:t xml:space="preserve">D# </w:t>
                             </w:r>
+                            <w:proofErr w:type="gramStart"/>
                             <w:r>
                               <w:t xml:space="preserve">{{ </w:t>
                             </w:r>
                             <w:proofErr w:type="spellStart"/>
                             <w:r>
-                              <w:t>document.doc_number</w:t>
+                              <w:t>document.doc</w:t>
+                            </w:r>
+                            <w:proofErr w:type="gramEnd"/>
+                            <w:r>
+                              <w:t>_</w:t>
+                            </w:r>
+                            <w:proofErr w:type="gramStart"/>
+                            <w:r>
+                              <w:t>number</w:t>
                             </w:r>
                             <w:proofErr w:type="spellEnd"/>
                             <w:r>
-                              <w:t xml:space="preserve"> }}  </w:t>
+                              <w:t xml:space="preserve"> }</w:t>
+                            </w:r>
+                            <w:proofErr w:type="gramEnd"/>
+                            <w:r>
+                              <w:t xml:space="preserve">}  </w:t>
                             </w:r>
                           </w:p>
                         </w:txbxContent>
@@ -2026,16 +2333,29 @@
                               </w:rPr>
                               <w:t xml:space="preserve"> </w:t>
                             </w:r>
+                            <w:proofErr w:type="gramStart"/>
                             <w:r>
                               <w:t xml:space="preserve">{{ </w:t>
                             </w:r>
                             <w:proofErr w:type="spellStart"/>
                             <w:r>
-                              <w:t>document.delivery_date</w:t>
+                              <w:t>document</w:t>
+                            </w:r>
+                            <w:proofErr w:type="gramEnd"/>
+                            <w:r>
+                              <w:t>.delivery_</w:t>
+                            </w:r>
+                            <w:proofErr w:type="gramStart"/>
+                            <w:r>
+                              <w:t>date</w:t>
                             </w:r>
                             <w:proofErr w:type="spellEnd"/>
                             <w:r>
-                              <w:t xml:space="preserve"> }}</w:t>
+                              <w:t xml:space="preserve"> }</w:t>
+                            </w:r>
+                            <w:proofErr w:type="gramEnd"/>
+                            <w:r>
+                              <w:t>}</w:t>
                             </w:r>
                           </w:p>
                         </w:txbxContent>
@@ -2182,6 +2502,7 @@
                 <w:b/>
                 <w:bCs/>
                 <w:sz w:val="18"/>
+                <w:szCs w:val="18"/>
               </w:rPr>
             </w:pPr>
             <w:r>
@@ -2190,6 +2511,7 @@
                 <w:b/>
                 <w:bCs/>
                 <w:sz w:val="18"/>
+                <w:szCs w:val="18"/>
               </w:rPr>
               <w:t>Code</w:t>
             </w:r>
@@ -2207,6 +2529,7 @@
                 <w:b/>
                 <w:bCs/>
                 <w:sz w:val="18"/>
+                <w:szCs w:val="18"/>
               </w:rPr>
             </w:pPr>
             <w:r>
@@ -2215,6 +2538,7 @@
                 <w:b/>
                 <w:bCs/>
                 <w:sz w:val="18"/>
+                <w:szCs w:val="18"/>
               </w:rPr>
               <w:t>Description</w:t>
             </w:r>
@@ -2236,6 +2560,7 @@
                 <w:b/>
                 <w:bCs/>
                 <w:sz w:val="18"/>
+                <w:szCs w:val="18"/>
               </w:rPr>
             </w:pPr>
           </w:p>
@@ -2253,6 +2578,7 @@
                 <w:b/>
                 <w:bCs/>
                 <w:sz w:val="18"/>
+                <w:szCs w:val="18"/>
               </w:rPr>
             </w:pPr>
             <w:r>
@@ -2261,6 +2587,7 @@
                 <w:b/>
                 <w:bCs/>
                 <w:sz w:val="18"/>
+                <w:szCs w:val="18"/>
               </w:rPr>
               <w:t>Unit</w:t>
             </w:r>
@@ -2272,6 +2599,7 @@
             <w:tcMar>
               <w:left w:w="113" w:type="dxa"/>
             </w:tcMar>
+            <w:vAlign w:val="center"/>
           </w:tcPr>
           <w:p>
             <w:pPr>
@@ -2281,6 +2609,7 @@
                 <w:b/>
                 <w:bCs/>
                 <w:sz w:val="18"/>
+                <w:szCs w:val="18"/>
               </w:rPr>
             </w:pPr>
             <w:r>
@@ -2289,6 +2618,7 @@
                 <w:b/>
                 <w:bCs/>
                 <w:sz w:val="18"/>
+                <w:szCs w:val="18"/>
               </w:rPr>
               <w:t>Ordered</w:t>
             </w:r>
@@ -2300,6 +2630,7 @@
             <w:tcMar>
               <w:left w:w="113" w:type="dxa"/>
             </w:tcMar>
+            <w:vAlign w:val="center"/>
           </w:tcPr>
           <w:p>
             <w:pPr>
@@ -2309,6 +2640,7 @@
                 <w:b/>
                 <w:bCs/>
                 <w:sz w:val="18"/>
+                <w:szCs w:val="18"/>
               </w:rPr>
             </w:pPr>
             <w:r>
@@ -2317,6 +2649,7 @@
                 <w:b/>
                 <w:bCs/>
                 <w:sz w:val="18"/>
+                <w:szCs w:val="18"/>
               </w:rPr>
               <w:t>Delivered</w:t>
             </w:r>
@@ -2330,6 +2663,9 @@
         <w:tc>
           <w:tcPr>
             <w:tcW w:w="973" w:type="dxa"/>
+            <w:tcBorders>
+              <w:bottom w:val="single" w:sz="4" w:space="0" w:color="auto"/>
+            </w:tcBorders>
             <w:tcMar>
               <w:left w:w="113" w:type="dxa"/>
             </w:tcMar>
@@ -2340,6 +2676,7 @@
               <w:rPr>
                 <w:rFonts w:ascii="Arial" w:eastAsia="Arial" w:hAnsi="Arial" w:cs="Arial"/>
                 <w:sz w:val="18"/>
+                <w:szCs w:val="18"/>
               </w:rPr>
             </w:pPr>
             <w:r>
@@ -2363,15 +2700,9 @@
                 <w:sz w:val="18"/>
                 <w:szCs w:val="18"/>
               </w:rPr>
-              <w:t xml:space="preserve"> %}</w:t>
+              <w:t xml:space="preserve"> %} </w:t>
             </w:r>
-            <w:r>
-              <w:rPr>
-                <w:sz w:val="18"/>
-                <w:szCs w:val="18"/>
-              </w:rPr>
-              <w:t xml:space="preserve"> </w:t>
-            </w:r>
+            <w:proofErr w:type="gramStart"/>
             <w:r>
               <w:rPr>
                 <w:sz w:val="18"/>
@@ -2388,6 +2719,7 @@
               <w:t>item.sku</w:t>
             </w:r>
             <w:proofErr w:type="spellEnd"/>
+            <w:proofErr w:type="gramEnd"/>
             <w:r>
               <w:rPr>
                 <w:sz w:val="18"/>
@@ -2400,6 +2732,10 @@
         <w:tc>
           <w:tcPr>
             <w:tcW w:w="3713" w:type="dxa"/>
+            <w:tcBorders>
+              <w:bottom w:val="single" w:sz="4" w:space="0" w:color="auto"/>
+            </w:tcBorders>
+            <w:vAlign w:val="center"/>
           </w:tcPr>
           <w:p>
             <w:pPr>
@@ -2409,6 +2745,7 @@
                 <w:szCs w:val="18"/>
               </w:rPr>
             </w:pPr>
+            <w:proofErr w:type="gramStart"/>
             <w:r>
               <w:rPr>
                 <w:sz w:val="18"/>
@@ -2422,7 +2759,15 @@
                 <w:sz w:val="18"/>
                 <w:szCs w:val="18"/>
               </w:rPr>
-              <w:t>item.description</w:t>
+              <w:t>item</w:t>
+            </w:r>
+            <w:proofErr w:type="gramEnd"/>
+            <w:r>
+              <w:rPr>
+                <w:sz w:val="18"/>
+                <w:szCs w:val="18"/>
+              </w:rPr>
+              <w:t>.description</w:t>
             </w:r>
             <w:proofErr w:type="spellEnd"/>
             <w:r>
@@ -2437,6 +2782,9 @@
         <w:tc>
           <w:tcPr>
             <w:tcW w:w="650" w:type="dxa"/>
+            <w:tcBorders>
+              <w:bottom w:val="single" w:sz="4" w:space="0" w:color="auto"/>
+            </w:tcBorders>
             <w:tcMar>
               <w:left w:w="113" w:type="dxa"/>
             </w:tcMar>
@@ -2445,6 +2793,10 @@
           <w:p>
             <w:pPr>
               <w:jc w:val="center"/>
+              <w:rPr>
+                <w:sz w:val="18"/>
+                <w:szCs w:val="18"/>
+              </w:rPr>
             </w:pPr>
           </w:p>
         </w:tc>
@@ -2459,6 +2811,7 @@
               <w:rPr>
                 <w:rFonts w:ascii="Arial" w:eastAsia="Arial" w:hAnsi="Arial" w:cs="Arial"/>
                 <w:sz w:val="18"/>
+                <w:szCs w:val="18"/>
               </w:rPr>
             </w:pPr>
           </w:p>
@@ -2476,24 +2829,54 @@
               <w:jc w:val="center"/>
               <w:rPr>
                 <w:rFonts w:ascii="Arial" w:eastAsia="Arial" w:hAnsi="Arial" w:cs="Arial"/>
-                <w:szCs w:val="36"/>
+                <w:sz w:val="18"/>
+                <w:szCs w:val="18"/>
               </w:rPr>
             </w:pPr>
+            <w:proofErr w:type="gramStart"/>
             <w:r>
+              <w:rPr>
+                <w:sz w:val="18"/>
+                <w:szCs w:val="18"/>
+              </w:rPr>
               <w:t xml:space="preserve">{{ </w:t>
             </w:r>
             <w:proofErr w:type="spellStart"/>
             <w:r>
-              <w:t>item.</w:t>
+              <w:rPr>
+                <w:sz w:val="18"/>
+                <w:szCs w:val="18"/>
+              </w:rPr>
+              <w:t>item</w:t>
+            </w:r>
+            <w:proofErr w:type="gramEnd"/>
+            <w:r>
+              <w:rPr>
+                <w:sz w:val="18"/>
+                <w:szCs w:val="18"/>
+              </w:rPr>
+              <w:t>.</w:t>
             </w:r>
             <w:r>
+              <w:rPr>
+                <w:sz w:val="18"/>
+                <w:szCs w:val="18"/>
+              </w:rPr>
               <w:t>o</w:t>
             </w:r>
             <w:r>
+              <w:rPr>
+                <w:sz w:val="18"/>
+                <w:szCs w:val="18"/>
+              </w:rPr>
               <w:t>qty</w:t>
             </w:r>
             <w:proofErr w:type="spellEnd"/>
             <w:r>
+              <w:rPr>
+                <w:sz w:val="18"/>
+                <w:szCs w:val="18"/>
+              </w:rPr>
               <w:t xml:space="preserve"> }}</w:t>
             </w:r>
           </w:p>
@@ -2504,19 +2887,23 @@
             <w:tcMar>
               <w:left w:w="113" w:type="dxa"/>
             </w:tcMar>
+            <w:vAlign w:val="center"/>
           </w:tcPr>
           <w:p>
             <w:pPr>
               <w:jc w:val="center"/>
               <w:rPr>
                 <w:rFonts w:ascii="Arial" w:eastAsia="Arial" w:hAnsi="Arial" w:cs="Arial"/>
-                <w:szCs w:val="36"/>
+                <w:sz w:val="18"/>
+                <w:szCs w:val="18"/>
               </w:rPr>
             </w:pPr>
+            <w:proofErr w:type="gramStart"/>
             <w:r>
               <w:rPr>
                 <w:rFonts w:ascii="Arial" w:eastAsia="Arial" w:hAnsi="Arial" w:cs="Arial"/>
-                <w:szCs w:val="36"/>
+                <w:sz w:val="18"/>
+                <w:szCs w:val="18"/>
               </w:rPr>
               <w:t xml:space="preserve">{{ </w:t>
             </w:r>
@@ -2524,29 +2911,26 @@
             <w:r>
               <w:rPr>
                 <w:rFonts w:ascii="Arial" w:eastAsia="Arial" w:hAnsi="Arial" w:cs="Arial"/>
-                <w:szCs w:val="36"/>
+                <w:sz w:val="18"/>
+                <w:szCs w:val="18"/>
               </w:rPr>
-              <w:t>item.</w:t>
+              <w:t>item</w:t>
             </w:r>
+            <w:proofErr w:type="gramEnd"/>
             <w:r>
               <w:rPr>
                 <w:rFonts w:ascii="Arial" w:eastAsia="Arial" w:hAnsi="Arial" w:cs="Arial"/>
-                <w:szCs w:val="36"/>
+                <w:sz w:val="18"/>
+                <w:szCs w:val="18"/>
               </w:rPr>
-              <w:t>d</w:t>
-            </w:r>
-            <w:r>
-              <w:rPr>
-                <w:rFonts w:ascii="Arial" w:eastAsia="Arial" w:hAnsi="Arial" w:cs="Arial"/>
-                <w:szCs w:val="36"/>
-              </w:rPr>
-              <w:t>qty</w:t>
+              <w:t>.dqty</w:t>
             </w:r>
             <w:proofErr w:type="spellEnd"/>
             <w:r>
               <w:rPr>
                 <w:rFonts w:ascii="Arial" w:eastAsia="Arial" w:hAnsi="Arial" w:cs="Arial"/>
-                <w:szCs w:val="36"/>
+                <w:sz w:val="18"/>
+                <w:szCs w:val="18"/>
               </w:rPr>
               <w:t xml:space="preserve"> }}</w:t>
             </w:r>
@@ -2560,6 +2944,11 @@
         <w:tc>
           <w:tcPr>
             <w:tcW w:w="973" w:type="dxa"/>
+            <w:tcBorders>
+              <w:left w:val="nil"/>
+              <w:bottom w:val="nil"/>
+              <w:right w:val="nil"/>
+            </w:tcBorders>
             <w:tcMar>
               <w:left w:w="113" w:type="dxa"/>
             </w:tcMar>
@@ -2570,12 +2959,14 @@
               <w:rPr>
                 <w:rFonts w:ascii="Arial" w:eastAsia="Arial" w:hAnsi="Arial" w:cs="Arial"/>
                 <w:sz w:val="18"/>
+                <w:szCs w:val="18"/>
               </w:rPr>
             </w:pPr>
             <w:r>
               <w:rPr>
                 <w:rFonts w:ascii="Arial" w:eastAsia="Arial" w:hAnsi="Arial" w:cs="Arial"/>
                 <w:sz w:val="18"/>
+                <w:szCs w:val="18"/>
               </w:rPr>
               <w:t xml:space="preserve">{% </w:t>
             </w:r>
@@ -2584,6 +2975,7 @@
               <w:rPr>
                 <w:rFonts w:ascii="Arial" w:eastAsia="Arial" w:hAnsi="Arial" w:cs="Arial"/>
                 <w:sz w:val="18"/>
+                <w:szCs w:val="18"/>
               </w:rPr>
               <w:t>endfor</w:t>
             </w:r>
@@ -2592,6 +2984,7 @@
               <w:rPr>
                 <w:rFonts w:ascii="Arial" w:eastAsia="Arial" w:hAnsi="Arial" w:cs="Arial"/>
                 <w:sz w:val="18"/>
+                <w:szCs w:val="18"/>
               </w:rPr>
               <w:t xml:space="preserve"> %}</w:t>
             </w:r>
@@ -2600,6 +2993,12 @@
         <w:tc>
           <w:tcPr>
             <w:tcW w:w="3713" w:type="dxa"/>
+            <w:tcBorders>
+              <w:left w:val="nil"/>
+              <w:bottom w:val="nil"/>
+              <w:right w:val="nil"/>
+            </w:tcBorders>
+            <w:vAlign w:val="center"/>
           </w:tcPr>
           <w:p>
             <w:pPr>
@@ -2609,6 +3008,7 @@
                 <w:b/>
                 <w:bCs/>
                 <w:sz w:val="18"/>
+                <w:szCs w:val="18"/>
               </w:rPr>
             </w:pPr>
           </w:p>
@@ -2616,6 +3016,10 @@
         <w:tc>
           <w:tcPr>
             <w:tcW w:w="650" w:type="dxa"/>
+            <w:tcBorders>
+              <w:left w:val="nil"/>
+              <w:bottom w:val="nil"/>
+            </w:tcBorders>
             <w:tcMar>
               <w:left w:w="113" w:type="dxa"/>
             </w:tcMar>
@@ -2629,6 +3033,7 @@
                 <w:b/>
                 <w:bCs/>
                 <w:sz w:val="18"/>
+                <w:szCs w:val="18"/>
               </w:rPr>
             </w:pPr>
           </w:p>
@@ -2643,13 +3048,15 @@
               <w:jc w:val="center"/>
               <w:rPr>
                 <w:rFonts w:ascii="Arial" w:eastAsia="Arial" w:hAnsi="Arial" w:cs="Arial"/>
-                <w:szCs w:val="36"/>
+                <w:sz w:val="18"/>
+                <w:szCs w:val="18"/>
               </w:rPr>
             </w:pPr>
             <w:r>
               <w:rPr>
                 <w:rFonts w:ascii="Arial" w:eastAsia="Arial" w:hAnsi="Arial" w:cs="Arial"/>
-                <w:szCs w:val="36"/>
+                <w:sz w:val="18"/>
+                <w:szCs w:val="18"/>
               </w:rPr>
               <w:t>Total</w:t>
             </w:r>
@@ -2669,12 +3076,15 @@
               <w:rPr>
                 <w:rFonts w:ascii="Arial" w:eastAsia="Arial" w:hAnsi="Arial" w:cs="Arial"/>
                 <w:sz w:val="18"/>
+                <w:szCs w:val="18"/>
               </w:rPr>
             </w:pPr>
+            <w:proofErr w:type="gramStart"/>
             <w:r>
               <w:rPr>
                 <w:rFonts w:ascii="Arial" w:eastAsia="Arial" w:hAnsi="Arial" w:cs="Arial"/>
                 <w:sz w:val="18"/>
+                <w:szCs w:val="18"/>
               </w:rPr>
               <w:t xml:space="preserve">{{ </w:t>
             </w:r>
@@ -2683,14 +3093,25 @@
               <w:rPr>
                 <w:rFonts w:ascii="Arial" w:eastAsia="Arial" w:hAnsi="Arial" w:cs="Arial"/>
                 <w:sz w:val="18"/>
+                <w:szCs w:val="18"/>
               </w:rPr>
-              <w:t>document.total_ordered</w:t>
+              <w:t>document</w:t>
+            </w:r>
+            <w:proofErr w:type="gramEnd"/>
+            <w:r>
+              <w:rPr>
+                <w:rFonts w:ascii="Arial" w:eastAsia="Arial" w:hAnsi="Arial" w:cs="Arial"/>
+                <w:sz w:val="18"/>
+                <w:szCs w:val="18"/>
+              </w:rPr>
+              <w:t>.total_ordered</w:t>
             </w:r>
             <w:proofErr w:type="spellEnd"/>
             <w:r>
               <w:rPr>
                 <w:rFonts w:ascii="Arial" w:eastAsia="Arial" w:hAnsi="Arial" w:cs="Arial"/>
                 <w:sz w:val="18"/>
+                <w:szCs w:val="18"/>
               </w:rPr>
               <w:t xml:space="preserve"> }}</w:t>
             </w:r>
@@ -2702,6 +3123,7 @@
             <w:tcMar>
               <w:left w:w="113" w:type="dxa"/>
             </w:tcMar>
+            <w:vAlign w:val="center"/>
           </w:tcPr>
           <w:p>
             <w:pPr>
@@ -2709,12 +3131,15 @@
               <w:rPr>
                 <w:rFonts w:ascii="Arial" w:eastAsia="Arial" w:hAnsi="Arial" w:cs="Arial"/>
                 <w:sz w:val="18"/>
+                <w:szCs w:val="18"/>
               </w:rPr>
             </w:pPr>
+            <w:proofErr w:type="gramStart"/>
             <w:r>
               <w:rPr>
                 <w:rFonts w:ascii="Arial" w:eastAsia="Arial" w:hAnsi="Arial" w:cs="Arial"/>
                 <w:sz w:val="18"/>
+                <w:szCs w:val="18"/>
               </w:rPr>
               <w:t xml:space="preserve">{{ </w:t>
             </w:r>
@@ -2723,16 +3148,45 @@
               <w:rPr>
                 <w:rFonts w:ascii="Arial" w:eastAsia="Arial" w:hAnsi="Arial" w:cs="Arial"/>
                 <w:sz w:val="18"/>
+                <w:szCs w:val="18"/>
               </w:rPr>
-              <w:t>document.total_delivered</w:t>
+              <w:t>document</w:t>
+            </w:r>
+            <w:proofErr w:type="gramEnd"/>
+            <w:r>
+              <w:rPr>
+                <w:rFonts w:ascii="Arial" w:eastAsia="Arial" w:hAnsi="Arial" w:cs="Arial"/>
+                <w:sz w:val="18"/>
+                <w:szCs w:val="18"/>
+              </w:rPr>
+              <w:t>.total_</w:t>
+            </w:r>
+            <w:proofErr w:type="gramStart"/>
+            <w:r>
+              <w:rPr>
+                <w:rFonts w:ascii="Arial" w:eastAsia="Arial" w:hAnsi="Arial" w:cs="Arial"/>
+                <w:sz w:val="18"/>
+                <w:szCs w:val="18"/>
+              </w:rPr>
+              <w:t>delivered</w:t>
             </w:r>
             <w:proofErr w:type="spellEnd"/>
             <w:r>
               <w:rPr>
                 <w:rFonts w:ascii="Arial" w:eastAsia="Arial" w:hAnsi="Arial" w:cs="Arial"/>
                 <w:sz w:val="18"/>
+                <w:szCs w:val="18"/>
               </w:rPr>
-              <w:t xml:space="preserve"> }} </w:t>
+              <w:t xml:space="preserve"> }</w:t>
+            </w:r>
+            <w:proofErr w:type="gramEnd"/>
+            <w:r>
+              <w:rPr>
+                <w:rFonts w:ascii="Arial" w:eastAsia="Arial" w:hAnsi="Arial" w:cs="Arial"/>
+                <w:sz w:val="18"/>
+                <w:szCs w:val="18"/>
+              </w:rPr>
+              <w:t>} </w:t>
             </w:r>
           </w:p>
         </w:tc>
@@ -3581,16 +4035,29 @@
                                 <w:szCs w:val="18"/>
                               </w:rPr>
                             </w:pPr>
+                            <w:proofErr w:type="gramStart"/>
                             <w:r>
                               <w:t xml:space="preserve">{{ </w:t>
                             </w:r>
                             <w:proofErr w:type="spellStart"/>
                             <w:r>
-                              <w:t>document.notes</w:t>
+                              <w:t>document</w:t>
+                            </w:r>
+                            <w:proofErr w:type="gramEnd"/>
+                            <w:r>
+                              <w:t>.</w:t>
+                            </w:r>
+                            <w:proofErr w:type="gramStart"/>
+                            <w:r>
+                              <w:t>notes</w:t>
                             </w:r>
                             <w:proofErr w:type="spellEnd"/>
                             <w:r>
-                              <w:t xml:space="preserve"> }}</w:t>
+                              <w:t xml:space="preserve"> }</w:t>
+                            </w:r>
+                            <w:proofErr w:type="gramEnd"/>
+                            <w:r>
+                              <w:t>}</w:t>
                             </w:r>
                           </w:p>
                           <w:p>
@@ -5235,17 +5702,6 @@
 </file>
 
 <file path=customXml/item1.xml><?xml version="1.0" encoding="utf-8"?>
-<p:properties xmlns:p="http://schemas.microsoft.com/office/2006/metadata/properties" xmlns:xsi="http://www.w3.org/2001/XMLSchema-instance" xmlns:pc="http://schemas.microsoft.com/office/infopath/2007/PartnerControls">
-  <documentManagement>
-    <lcf76f155ced4ddcb4097134ff3c332f xmlns="9f4890a8-e5d9-469a-a643-6fab56be3d5c">
-      <Terms xmlns="http://schemas.microsoft.com/office/infopath/2007/PartnerControls"/>
-    </lcf76f155ced4ddcb4097134ff3c332f>
-    <TaxCatchAll xmlns="2e85fd7c-2c4d-4f72-bc1a-40a1d4795440" xsi:nil="true"/>
-  </documentManagement>
-</p:properties>
-</file>
-
-<file path=customXml/item2.xml><?xml version="1.0" encoding="utf-8"?>
 <?mso-contentType ?>
 <FormTemplates xmlns="http://schemas.microsoft.com/sharepoint/v3/contenttype/forms">
   <Display>DocumentLibraryForm</Display>
@@ -5254,7 +5710,7 @@
 </FormTemplates>
 </file>
 
-<file path=customXml/item3.xml><?xml version="1.0" encoding="utf-8"?>
+<file path=customXml/item2.xml><?xml version="1.0" encoding="utf-8"?>
 <ct:contentTypeSchema xmlns:ct="http://schemas.microsoft.com/office/2006/metadata/contentType" xmlns:ma="http://schemas.microsoft.com/office/2006/metadata/properties/metaAttributes" ct:_="" ma:_="" ma:contentTypeName="Document" ma:contentTypeID="0x01010084BBB28352D0644E8ED6554443A62D27" ma:contentTypeVersion="12" ma:contentTypeDescription="Create a new document." ma:contentTypeScope="" ma:versionID="4d3ca2e56bcdcc783dc073530a37af53">
   <xsd:schema xmlns:xsd="http://www.w3.org/2001/XMLSchema" xmlns:xs="http://www.w3.org/2001/XMLSchema" xmlns:p="http://schemas.microsoft.com/office/2006/metadata/properties" xmlns:ns2="9f4890a8-e5d9-469a-a643-6fab56be3d5c" xmlns:ns3="2e85fd7c-2c4d-4f72-bc1a-40a1d4795440" targetNamespace="http://schemas.microsoft.com/office/2006/metadata/properties" ma:root="true" ma:fieldsID="719b33dc4db2555a4e2b3773b8f34413" ns2:_="" ns3:_="">
     <xsd:import namespace="9f4890a8-e5d9-469a-a643-6fab56be3d5c"/>
@@ -5455,18 +5911,18 @@
 </ct:contentTypeSchema>
 </file>
 
-<file path=customXml/itemProps1.xml><?xml version="1.0" encoding="utf-8"?>
-<ds:datastoreItem xmlns:ds="http://schemas.openxmlformats.org/officeDocument/2006/customXml" ds:itemID="{3A43F0E8-ACB8-402B-BFF7-225BCFFAE8A7}">
-  <ds:schemaRefs>
-    <ds:schemaRef ds:uri="http://schemas.microsoft.com/office/2006/metadata/properties"/>
-    <ds:schemaRef ds:uri="http://schemas.microsoft.com/office/infopath/2007/PartnerControls"/>
-    <ds:schemaRef ds:uri="9f4890a8-e5d9-469a-a643-6fab56be3d5c"/>
-    <ds:schemaRef ds:uri="2e85fd7c-2c4d-4f72-bc1a-40a1d4795440"/>
-  </ds:schemaRefs>
-</ds:datastoreItem>
+<file path=customXml/item3.xml><?xml version="1.0" encoding="utf-8"?>
+<p:properties xmlns:p="http://schemas.microsoft.com/office/2006/metadata/properties" xmlns:xsi="http://www.w3.org/2001/XMLSchema-instance" xmlns:pc="http://schemas.microsoft.com/office/infopath/2007/PartnerControls">
+  <documentManagement>
+    <lcf76f155ced4ddcb4097134ff3c332f xmlns="9f4890a8-e5d9-469a-a643-6fab56be3d5c">
+      <Terms xmlns="http://schemas.microsoft.com/office/infopath/2007/PartnerControls"/>
+    </lcf76f155ced4ddcb4097134ff3c332f>
+    <TaxCatchAll xmlns="2e85fd7c-2c4d-4f72-bc1a-40a1d4795440" xsi:nil="true"/>
+  </documentManagement>
+</p:properties>
 </file>
 
-<file path=customXml/itemProps2.xml><?xml version="1.0" encoding="utf-8"?>
+<file path=customXml/itemProps1.xml><?xml version="1.0" encoding="utf-8"?>
 <ds:datastoreItem xmlns:ds="http://schemas.openxmlformats.org/officeDocument/2006/customXml" ds:itemID="{E79FFF2E-D09A-4FE6-8320-5EDC6415C7B5}">
   <ds:schemaRefs>
     <ds:schemaRef ds:uri="http://schemas.microsoft.com/sharepoint/v3/contenttype/forms"/>
@@ -5474,7 +5930,7 @@
 </ds:datastoreItem>
 </file>
 
-<file path=customXml/itemProps3.xml><?xml version="1.0" encoding="utf-8"?>
+<file path=customXml/itemProps2.xml><?xml version="1.0" encoding="utf-8"?>
 <ds:datastoreItem xmlns:ds="http://schemas.openxmlformats.org/officeDocument/2006/customXml" ds:itemID="{5C138A9A-C040-40DF-B9E3-E047B2CE552E}">
   <ds:schemaRefs>
     <ds:schemaRef ds:uri="http://schemas.microsoft.com/office/2006/metadata/contentType"/>
@@ -5491,4 +5947,15 @@
     <ds:schemaRef ds:uri="http://schemas.microsoft.com/internal/obd"/>
   </ds:schemaRefs>
 </ds:datastoreItem>
+</file>
+
+<file path=customXml/itemProps3.xml><?xml version="1.0" encoding="utf-8"?>
+<ds:datastoreItem xmlns:ds="http://schemas.openxmlformats.org/officeDocument/2006/customXml" ds:itemID="{3A43F0E8-ACB8-402B-BFF7-225BCFFAE8A7}">
+  <ds:schemaRefs>
+    <ds:schemaRef ds:uri="http://schemas.microsoft.com/office/2006/metadata/properties"/>
+    <ds:schemaRef ds:uri="http://schemas.microsoft.com/office/infopath/2007/PartnerControls"/>
+    <ds:schemaRef ds:uri="9f4890a8-e5d9-469a-a643-6fab56be3d5c"/>
+    <ds:schemaRef ds:uri="2e85fd7c-2c4d-4f72-bc1a-40a1d4795440"/>
+  </ds:schemaRefs>
+</ds:datastoreItem>
 </file>
</xml_diff>